<commit_message>
Updated the Readme file
</commit_message>
<xml_diff>
--- a/AI-General-Assembly-Training/2025/Power-BI-Capstone-Project/Power BI Capstone Project.docx
+++ b/AI-General-Assembly-Training/2025/Power-BI-Capstone-Project/Power BI Capstone Project.docx
@@ -856,54 +856,15 @@
         <w:t>entirety:</w:t>
       </w:r>
       <w:r>
-        <w:rPr>
-          <w:spacing w:val="-1"/>
-          <w:sz w:val="24"/>
-        </w:rPr>
-        <w:t xml:space="preserve"> </w:t>
-      </w:r>
-      <w:hyperlink r:id="rId5">
+        <w:t xml:space="preserve"> </w:t>
+      </w:r>
+      <w:hyperlink r:id="rId5" w:history="1">
         <w:r>
           <w:rPr>
-            <w:color w:val="0000FF"/>
+            <w:rStyle w:val="Hyperlink"/>
             <w:sz w:val="24"/>
-            <w:u w:val="single" w:color="0000FF"/>
           </w:rPr>
-          <w:t>Tourism</w:t>
-        </w:r>
-        <w:r>
-          <w:rPr>
-            <w:color w:val="0000FF"/>
-            <w:spacing w:val="-6"/>
-            <w:sz w:val="24"/>
-            <w:u w:val="single" w:color="0000FF"/>
-          </w:rPr>
-          <w:t xml:space="preserve"> </w:t>
-        </w:r>
-        <w:r>
-          <w:rPr>
-            <w:color w:val="0000FF"/>
-            <w:sz w:val="24"/>
-            <w:u w:val="single" w:color="0000FF"/>
-          </w:rPr>
-          <w:t>and</w:t>
-        </w:r>
-      </w:hyperlink>
-      <w:r>
-        <w:rPr>
-          <w:color w:val="0000FF"/>
-          <w:sz w:val="24"/>
-        </w:rPr>
-        <w:t xml:space="preserve"> </w:t>
-      </w:r>
-      <w:hyperlink r:id="rId6">
-        <w:r>
-          <w:rPr>
-            <w:color w:val="0000FF"/>
-            <w:sz w:val="24"/>
-            <w:u w:val="single" w:color="0000FF"/>
-          </w:rPr>
-          <w:t>Hospitality Data Analysis Dashboard</w:t>
+          <w:t>https://youtu.be/dQrofw6oVXY</w:t>
         </w:r>
       </w:hyperlink>
       <w:r>
@@ -944,24 +905,23 @@
       </w:r>
       <w:r>
         <w:rPr>
-          <w:spacing w:val="-3"/>
-          <w:sz w:val="24"/>
-        </w:rPr>
-        <w:t xml:space="preserve"> </w:t>
-      </w:r>
-      <w:r>
-        <w:rPr>
-          <w:sz w:val="24"/>
-        </w:rPr>
-        <w:t xml:space="preserve">Use the Tourism and Hospitality dataset provided in the Excel file available at the following link: </w:t>
-      </w:r>
-      <w:hyperlink r:id="rId7" w:history="1">
+          <w:sz w:val="24"/>
+        </w:rPr>
+        <w:t xml:space="preserve"> Download and u</w:t>
+      </w:r>
+      <w:r>
+        <w:rPr>
+          <w:sz w:val="24"/>
+        </w:rPr>
+        <w:t xml:space="preserve">se the Tourism and Hospitality dataset provided in the Excel file available at the following link: </w:t>
+      </w:r>
+      <w:hyperlink r:id="rId6" w:history="1">
         <w:r>
           <w:rPr>
             <w:rStyle w:val="Hyperlink"/>
             <w:sz w:val="24"/>
           </w:rPr>
-          <w:t>https://youtu.be/YpmW3PTlShc</w:t>
+          <w:t>https://bit.ly/3SV8Cch</w:t>
         </w:r>
       </w:hyperlink>
       <w:r>
@@ -3477,41 +3437,55 @@
         <w:rPr>
           <w:sz w:val="24"/>
         </w:rPr>
-        <w:t>Friday,</w:t>
-      </w:r>
-      <w:r>
-        <w:rPr>
-          <w:spacing w:val="-1"/>
-          <w:sz w:val="24"/>
-        </w:rPr>
-        <w:t xml:space="preserve"> </w:t>
-      </w:r>
-      <w:r>
-        <w:rPr>
-          <w:sz w:val="24"/>
-        </w:rPr>
-        <w:t>August</w:t>
-      </w:r>
-      <w:r>
-        <w:rPr>
-          <w:spacing w:val="-1"/>
-          <w:sz w:val="24"/>
-        </w:rPr>
-        <w:t xml:space="preserve"> </w:t>
-      </w:r>
-      <w:r>
-        <w:rPr>
-          <w:sz w:val="24"/>
-        </w:rPr>
-        <w:t xml:space="preserve">30, </w:t>
-      </w:r>
-      <w:r>
-        <w:rPr>
-          <w:spacing w:val="-4"/>
-          <w:sz w:val="24"/>
-        </w:rPr>
-        <w:t>2024</w:t>
-      </w:r>
+        <w:t>Sunday</w:t>
+      </w:r>
+      <w:r>
+        <w:rPr>
+          <w:sz w:val="24"/>
+        </w:rPr>
+        <w:t>,</w:t>
+      </w:r>
+      <w:r>
+        <w:rPr>
+          <w:spacing w:val="-1"/>
+          <w:sz w:val="24"/>
+        </w:rPr>
+        <w:t xml:space="preserve"> </w:t>
+      </w:r>
+      <w:r>
+        <w:rPr>
+          <w:sz w:val="24"/>
+        </w:rPr>
+        <w:t>June 2</w:t>
+      </w:r>
+      <w:r>
+        <w:rPr>
+          <w:sz w:val="24"/>
+        </w:rPr>
+        <w:t>9</w:t>
+      </w:r>
+      <w:r>
+        <w:rPr>
+          <w:sz w:val="24"/>
+        </w:rPr>
+        <w:t xml:space="preserve">, </w:t>
+      </w:r>
+      <w:r>
+        <w:rPr>
+          <w:spacing w:val="-4"/>
+          <w:sz w:val="24"/>
+        </w:rPr>
+        <w:t>2025</w:t>
+      </w:r>
+      <w:r>
+        <w:rPr>
+          <w:spacing w:val="-4"/>
+          <w:sz w:val="24"/>
+        </w:rPr>
+        <w:t xml:space="preserve"> at 5pm. </w:t>
+      </w:r>
+      <w:bookmarkStart w:id="0" w:name="_GoBack"/>
+      <w:bookmarkEnd w:id="0"/>
     </w:p>
     <w:p>
       <w:pPr>
@@ -3560,7 +3534,6 @@
         <w:tabs>
           <w:tab w:val="left" w:pos="720"/>
         </w:tabs>
-        <w:ind w:hanging="360"/>
         <w:rPr>
           <w:sz w:val="24"/>
         </w:rPr>
@@ -3584,91 +3557,33 @@
         <w:rPr>
           <w:b/>
           <w:sz w:val="24"/>
+          <w:szCs w:val="24"/>
         </w:rPr>
         <w:t>Tutorial</w:t>
       </w:r>
       <w:r>
         <w:rPr>
           <w:sz w:val="24"/>
+          <w:szCs w:val="24"/>
         </w:rPr>
         <w:t xml:space="preserve">: </w:t>
       </w:r>
-      <w:hyperlink r:id="rId8">
+      <w:hyperlink r:id="rId7" w:history="1">
         <w:r>
           <w:rPr>
-            <w:color w:val="0000FF"/>
+            <w:rStyle w:val="Hyperlink"/>
             <w:sz w:val="24"/>
-            <w:u w:val="single" w:color="0000FF"/>
+            <w:szCs w:val="24"/>
           </w:rPr>
-          <w:t>Tourism</w:t>
-        </w:r>
-        <w:r>
-          <w:rPr>
-            <w:color w:val="0000FF"/>
-            <w:spacing w:val="-1"/>
-            <w:sz w:val="24"/>
-            <w:u w:val="single" w:color="0000FF"/>
-          </w:rPr>
-          <w:t xml:space="preserve"> </w:t>
-        </w:r>
-        <w:r>
-          <w:rPr>
-            <w:color w:val="0000FF"/>
-            <w:sz w:val="24"/>
-            <w:u w:val="single" w:color="0000FF"/>
-          </w:rPr>
-          <w:t>and</w:t>
-        </w:r>
-        <w:r>
-          <w:rPr>
-            <w:color w:val="0000FF"/>
-            <w:spacing w:val="-1"/>
-            <w:sz w:val="24"/>
-            <w:u w:val="single" w:color="0000FF"/>
-          </w:rPr>
-          <w:t xml:space="preserve"> </w:t>
-        </w:r>
-        <w:r>
-          <w:rPr>
-            <w:color w:val="0000FF"/>
-            <w:sz w:val="24"/>
-            <w:u w:val="single" w:color="0000FF"/>
-          </w:rPr>
-          <w:t>Hospitality Data</w:t>
-        </w:r>
-        <w:r>
-          <w:rPr>
-            <w:color w:val="0000FF"/>
-            <w:spacing w:val="-1"/>
-            <w:sz w:val="24"/>
-            <w:u w:val="single" w:color="0000FF"/>
-          </w:rPr>
-          <w:t xml:space="preserve"> </w:t>
-        </w:r>
-        <w:r>
-          <w:rPr>
-            <w:color w:val="0000FF"/>
-            <w:sz w:val="24"/>
-            <w:u w:val="single" w:color="0000FF"/>
-          </w:rPr>
-          <w:t xml:space="preserve">Analysis </w:t>
-        </w:r>
-        <w:r>
-          <w:rPr>
-            <w:color w:val="0000FF"/>
-            <w:spacing w:val="-2"/>
-            <w:sz w:val="24"/>
-            <w:u w:val="single" w:color="0000FF"/>
-          </w:rPr>
-          <w:t>Dashboard</w:t>
+          <w:t>https://youtu.be/dQrofw6oVXY</w:t>
         </w:r>
       </w:hyperlink>
       <w:r>
         <w:rPr>
-          <w:spacing w:val="-2"/>
-          <w:sz w:val="24"/>
-        </w:rPr>
-        <w:t>.</w:t>
+          <w:sz w:val="24"/>
+          <w:szCs w:val="24"/>
+        </w:rPr>
+        <w:t xml:space="preserve"> </w:t>
       </w:r>
     </w:p>
     <w:p>
@@ -3698,64 +3613,17 @@
         <w:rPr>
           <w:sz w:val="24"/>
         </w:rPr>
-        <w:t>: [</w:t>
-      </w:r>
-      <w:hyperlink r:id="rId9" w:history="1">
+        <w:t xml:space="preserve">: </w:t>
+      </w:r>
+      <w:hyperlink r:id="rId8" w:history="1">
         <w:r>
           <w:rPr>
             <w:rStyle w:val="Hyperlink"/>
             <w:sz w:val="24"/>
           </w:rPr>
-          <w:t>Tourism</w:t>
-        </w:r>
-        <w:r>
-          <w:rPr>
-            <w:rStyle w:val="Hyperlink"/>
-            <w:spacing w:val="-2"/>
-            <w:sz w:val="24"/>
-          </w:rPr>
-          <w:t xml:space="preserve"> </w:t>
-        </w:r>
-        <w:r>
-          <w:rPr>
-            <w:rStyle w:val="Hyperlink"/>
-            <w:sz w:val="24"/>
-          </w:rPr>
-          <w:t>and Hospitality</w:t>
-        </w:r>
-        <w:r>
-          <w:rPr>
-            <w:rStyle w:val="Hyperlink"/>
-            <w:spacing w:val="-1"/>
-            <w:sz w:val="24"/>
-          </w:rPr>
-          <w:t xml:space="preserve"> </w:t>
-        </w:r>
-        <w:r>
-          <w:rPr>
-            <w:rStyle w:val="Hyperlink"/>
-            <w:sz w:val="24"/>
-          </w:rPr>
-          <w:t xml:space="preserve">Excel </w:t>
-        </w:r>
-        <w:r>
-          <w:rPr>
-            <w:rStyle w:val="Hyperlink"/>
-            <w:spacing w:val="-2"/>
-            <w:sz w:val="24"/>
-          </w:rPr>
-          <w:t>file</w:t>
+          <w:t>https://bit.ly/3SV8Cch</w:t>
         </w:r>
       </w:hyperlink>
-      <w:bookmarkStart w:id="0" w:name="_GoBack"/>
-      <w:bookmarkEnd w:id="0"/>
-      <w:r>
-        <w:rPr>
-          <w:spacing w:val="-2"/>
-          <w:sz w:val="24"/>
-        </w:rPr>
-        <w:t>].</w:t>
-      </w:r>
     </w:p>
     <w:p>
       <w:pPr>
@@ -4646,19 +4514,11 @@
   <w:docDefaults>
     <w:rPrDefault>
       <w:rPr>
-        <w:rFonts w:asciiTheme="minorHAnsi" w:eastAsiaTheme="minorHAnsi" w:hAnsiTheme="minorHAnsi" w:cstheme="minorBidi"/>
-        <w:sz w:val="22"/>
-        <w:szCs w:val="22"/>
+        <w:rFonts w:ascii="Calibri" w:eastAsia="Calibri" w:hAnsi="Calibri" w:cs="Times New Roman"/>
         <w:lang w:val="en-US" w:eastAsia="en-US" w:bidi="ar-SA"/>
       </w:rPr>
     </w:rPrDefault>
-    <w:pPrDefault>
-      <w:pPr>
-        <w:widowControl w:val="0"/>
-        <w:autoSpaceDE w:val="0"/>
-        <w:autoSpaceDN w:val="0"/>
-      </w:pPr>
-    </w:pPrDefault>
+    <w:pPrDefault/>
   </w:docDefaults>
   <w:latentStyles w:defLockedState="0" w:defUIPriority="99" w:defSemiHidden="0" w:defUnhideWhenUsed="0" w:defQFormat="0" w:count="371">
     <w:lsdException w:name="Normal" w:uiPriority="0" w:qFormat="1"/>
@@ -5037,8 +4897,15 @@
     <w:name w:val="Normal"/>
     <w:uiPriority w:val="1"/>
     <w:qFormat/>
+    <w:pPr>
+      <w:widowControl w:val="0"/>
+      <w:autoSpaceDE w:val="0"/>
+      <w:autoSpaceDN w:val="0"/>
+    </w:pPr>
     <w:rPr>
-      <w:rFonts w:ascii="Times New Roman" w:eastAsia="Times New Roman" w:hAnsi="Times New Roman" w:cs="Times New Roman"/>
+      <w:rFonts w:ascii="Times New Roman" w:eastAsia="Times New Roman" w:hAnsi="Times New Roman"/>
+      <w:sz w:val="22"/>
+      <w:szCs w:val="22"/>
     </w:rPr>
   </w:style>
   <w:style w:type="paragraph" w:styleId="Heading1">
@@ -5128,12 +4995,22 @@
   </w:style>
   <w:style w:type="character" w:styleId="Hyperlink">
     <w:name w:val="Hyperlink"/>
-    <w:basedOn w:val="DefaultParagraphFont"/>
     <w:uiPriority w:val="99"/>
     <w:unhideWhenUsed/>
     <w:rsid w:val="00826AC1"/>
     <w:rPr>
-      <w:color w:val="0000FF" w:themeColor="hyperlink"/>
+      <w:color w:val="0000FF"/>
+      <w:u w:val="single"/>
+    </w:rPr>
+  </w:style>
+  <w:style w:type="character" w:styleId="FollowedHyperlink">
+    <w:name w:val="FollowedHyperlink"/>
+    <w:uiPriority w:val="99"/>
+    <w:semiHidden/>
+    <w:unhideWhenUsed/>
+    <w:rsid w:val="002402C8"/>
+    <w:rPr>
+      <w:color w:val="800080"/>
       <w:u w:val="single"/>
     </w:rPr>
   </w:style>

</xml_diff>